<commit_message>
Use 'Base' wording, show the 7 Consein services, local bank financing
- Rename 'Núcleo' to 'Base' (layers diagram, hero core label, copy)
- 'Cómo trabajamos' now shows the 7 services of the Consein Cisco Service
  Model (S1–S7), derived from the value matrix: name, practice areas and
  product count, linking to Soluciones de Valor
- Renovación financiada (REN-07): Consein manages financing requests with
  local banks, which evaluate each case and decide feasibility; removes
  Cisco Capital, trade-in and Cisco Refresh references from the site,
  the Ofertas de Productos notice and the SEO keyword list

Co-Authored-By: Claude Opus 5.5 <noreply@anthropic.com>
Claude-Session: https://claude.ai/code/session_01H6AF8PmtHtRfTJNyr7b15s
</commit_message>
<xml_diff>
--- a/consein-cisco/Palabras_clave_SEO_Consein_Cisco.docx
+++ b/consein-cisco/Palabras_clave_SEO_Consein_Cisco.docx
@@ -14421,35 +14421,35 @@
                 <w:sz w:val="19"/>
                 <w:szCs w:val="19"/>
               </w:rPr>
-              <w:t xml:space="preserve">financiamiento Cisco Capital</w:t>
-            </w:r>
-          </w:p>
-        </w:tc>
-        <w:tc>
-          <w:tcPr>
-            <w:tcW w:type="dxa" w:w="1350"/>
-            <w:tcBorders>
-              <w:top w:val="single" w:color="D9DCE6" w:sz="4"/>
-              <w:left w:val="single" w:color="D9DCE6" w:sz="4"/>
-              <w:bottom w:val="single" w:color="D9DCE6" w:sz="4"/>
-              <w:right w:val="single" w:color="D9DCE6" w:sz="4"/>
-            </w:tcBorders>
-            <w:tcMar>
-              <w:top w:type="dxa" w:w="70"/>
-              <w:left w:type="dxa" w:w="110"/>
-              <w:bottom w:type="dxa" w:w="70"/>
-              <w:right w:type="dxa" w:w="110"/>
-            </w:tcMar>
-          </w:tcPr>
-          <w:p>
-            <w:r>
-              <w:rPr>
-                <w:b w:val="false"/>
-                <w:bCs w:val="false"/>
-                <w:sz w:val="19"/>
-                <w:szCs w:val="19"/>
-              </w:rPr>
-              <w:t xml:space="preserve">Producto</w:t>
+              <w:t xml:space="preserve">financiamiento para renovación tecnológica</w:t>
+            </w:r>
+          </w:p>
+        </w:tc>
+        <w:tc>
+          <w:tcPr>
+            <w:tcW w:type="dxa" w:w="1350"/>
+            <w:tcBorders>
+              <w:top w:val="single" w:color="D9DCE6" w:sz="4"/>
+              <w:left w:val="single" w:color="D9DCE6" w:sz="4"/>
+              <w:bottom w:val="single" w:color="D9DCE6" w:sz="4"/>
+              <w:right w:val="single" w:color="D9DCE6" w:sz="4"/>
+            </w:tcBorders>
+            <w:tcMar>
+              <w:top w:type="dxa" w:w="70"/>
+              <w:left w:type="dxa" w:w="110"/>
+              <w:bottom w:type="dxa" w:w="70"/>
+              <w:right w:type="dxa" w:w="110"/>
+            </w:tcMar>
+          </w:tcPr>
+          <w:p>
+            <w:r>
+              <w:rPr>
+                <w:b w:val="false"/>
+                <w:bCs w:val="false"/>
+                <w:sz w:val="19"/>
+                <w:szCs w:val="19"/>
+              </w:rPr>
+              <w:t xml:space="preserve">Secundaria</w:t>
             </w:r>
           </w:p>
         </w:tc>
@@ -14563,63 +14563,63 @@
                 <w:sz w:val="19"/>
                 <w:szCs w:val="19"/>
               </w:rPr>
-              <w:t xml:space="preserve">Cisco Refresh equipos certificados</w:t>
-            </w:r>
-          </w:p>
-        </w:tc>
-        <w:tc>
-          <w:tcPr>
-            <w:tcW w:type="dxa" w:w="1350"/>
-            <w:tcBorders>
-              <w:top w:val="single" w:color="D9DCE6" w:sz="4"/>
-              <w:left w:val="single" w:color="D9DCE6" w:sz="4"/>
-              <w:bottom w:val="single" w:color="D9DCE6" w:sz="4"/>
-              <w:right w:val="single" w:color="D9DCE6" w:sz="4"/>
-            </w:tcBorders>
-            <w:tcMar>
-              <w:top w:type="dxa" w:w="70"/>
-              <w:left w:type="dxa" w:w="110"/>
-              <w:bottom w:type="dxa" w:w="70"/>
-              <w:right w:type="dxa" w:w="110"/>
-            </w:tcMar>
-          </w:tcPr>
-          <w:p>
-            <w:r>
-              <w:rPr>
-                <w:b w:val="false"/>
-                <w:bCs w:val="false"/>
-                <w:sz w:val="19"/>
-                <w:szCs w:val="19"/>
-              </w:rPr>
-              <w:t xml:space="preserve">Producto</w:t>
-            </w:r>
-          </w:p>
-        </w:tc>
-        <w:tc>
-          <w:tcPr>
-            <w:tcW w:type="dxa" w:w="1350"/>
-            <w:tcBorders>
-              <w:top w:val="single" w:color="D9DCE6" w:sz="4"/>
-              <w:left w:val="single" w:color="D9DCE6" w:sz="4"/>
-              <w:bottom w:val="single" w:color="D9DCE6" w:sz="4"/>
-              <w:right w:val="single" w:color="D9DCE6" w:sz="4"/>
-            </w:tcBorders>
-            <w:tcMar>
-              <w:top w:type="dxa" w:w="70"/>
-              <w:left w:type="dxa" w:w="110"/>
-              <w:bottom w:type="dxa" w:w="70"/>
-              <w:right w:type="dxa" w:w="110"/>
-            </w:tcMar>
-          </w:tcPr>
-          <w:p>
-            <w:r>
-              <w:rPr>
-                <w:b w:val="false"/>
-                <w:bCs w:val="false"/>
-                <w:sz w:val="19"/>
-                <w:szCs w:val="19"/>
-              </w:rPr>
-              <w:t xml:space="preserve">Comercial</w:t>
+              <w:t xml:space="preserve">financiamiento bancario de equipos de red</w:t>
+            </w:r>
+          </w:p>
+        </w:tc>
+        <w:tc>
+          <w:tcPr>
+            <w:tcW w:type="dxa" w:w="1350"/>
+            <w:tcBorders>
+              <w:top w:val="single" w:color="D9DCE6" w:sz="4"/>
+              <w:left w:val="single" w:color="D9DCE6" w:sz="4"/>
+              <w:bottom w:val="single" w:color="D9DCE6" w:sz="4"/>
+              <w:right w:val="single" w:color="D9DCE6" w:sz="4"/>
+            </w:tcBorders>
+            <w:tcMar>
+              <w:top w:type="dxa" w:w="70"/>
+              <w:left w:type="dxa" w:w="110"/>
+              <w:bottom w:type="dxa" w:w="70"/>
+              <w:right w:type="dxa" w:w="110"/>
+            </w:tcMar>
+          </w:tcPr>
+          <w:p>
+            <w:r>
+              <w:rPr>
+                <w:b w:val="false"/>
+                <w:bCs w:val="false"/>
+                <w:sz w:val="19"/>
+                <w:szCs w:val="19"/>
+              </w:rPr>
+              <w:t xml:space="preserve">Long tail</w:t>
+            </w:r>
+          </w:p>
+        </w:tc>
+        <w:tc>
+          <w:tcPr>
+            <w:tcW w:type="dxa" w:w="1350"/>
+            <w:tcBorders>
+              <w:top w:val="single" w:color="D9DCE6" w:sz="4"/>
+              <w:left w:val="single" w:color="D9DCE6" w:sz="4"/>
+              <w:bottom w:val="single" w:color="D9DCE6" w:sz="4"/>
+              <w:right w:val="single" w:color="D9DCE6" w:sz="4"/>
+            </w:tcBorders>
+            <w:tcMar>
+              <w:top w:type="dxa" w:w="70"/>
+              <w:left w:type="dxa" w:w="110"/>
+              <w:bottom w:type="dxa" w:w="70"/>
+              <w:right w:type="dxa" w:w="110"/>
+            </w:tcMar>
+          </w:tcPr>
+          <w:p>
+            <w:r>
+              <w:rPr>
+                <w:b w:val="false"/>
+                <w:bCs w:val="false"/>
+                <w:sz w:val="19"/>
+                <w:szCs w:val="19"/>
+              </w:rPr>
+              <w:t xml:space="preserve">Transaccional</w:t>
             </w:r>
           </w:p>
         </w:tc>

</xml_diff>